<commit_message>
part b is done
</commit_message>
<xml_diff>
--- a/205744873_213474349_hw4_report.docx
+++ b/205744873_213474349_hw4_report.docx
@@ -94,8 +94,8 @@
           <w:lang w:bidi="he-IL"/>
         </w:rPr>
         <w:br/>
-        <w:t xml:space="preserve">מלכ עואודה </w:t>
-      </w:r>
+      </w:r>
+      <w:proofErr w:type="spellStart"/>
       <w:r>
         <w:rPr>
           <w:rFonts w:ascii="Times New Roman" w:hAnsi="Times New Roman" w:cs="Times New Roman"/>
@@ -108,11 +108,12 @@
           <w:rtl/>
           <w:lang w:bidi="he-IL"/>
         </w:rPr>
-        <w:t>213474349</w:t>
-      </w:r>
-      <w:r>
-        <w:rPr>
-          <w:rFonts w:ascii="Times New Roman" w:hAnsi="Times New Roman" w:cs="Times New Roman" w:hint="cs"/>
+        <w:t>מלכ</w:t>
+      </w:r>
+      <w:proofErr w:type="spellEnd"/>
+      <w:r>
+        <w:rPr>
+          <w:rFonts w:ascii="Times New Roman" w:hAnsi="Times New Roman" w:cs="Times New Roman"/>
           <w:b/>
           <w:bCs/>
           <w:i/>
@@ -122,23 +123,10 @@
           <w:rtl/>
           <w:lang w:bidi="he-IL"/>
         </w:rPr>
-        <w:t>.</w:t>
-      </w:r>
-    </w:p>
-    <w:p>
-      <w:pPr>
-        <w:bidi/>
-        <w:rPr>
-          <w:rFonts w:ascii="Times New Roman" w:hAnsi="Times New Roman" w:cs="Times New Roman"/>
-          <w:sz w:val="32"/>
-          <w:szCs w:val="32"/>
-          <w:lang w:bidi="he-IL"/>
-        </w:rPr>
-      </w:pPr>
-    </w:p>
-    <w:p>
-      <w:pPr>
-        <w:bidi/>
+        <w:t xml:space="preserve"> </w:t>
+      </w:r>
+      <w:proofErr w:type="spellStart"/>
+      <w:r>
         <w:rPr>
           <w:rFonts w:ascii="Times New Roman" w:hAnsi="Times New Roman" w:cs="Times New Roman"/>
           <w:b/>
@@ -147,20 +135,91 @@
           <w:iCs/>
           <w:sz w:val="32"/>
           <w:szCs w:val="32"/>
-          <w:u w:val="single"/>
-          <w:rtl/>
-          <w:lang w:bidi="he-IL"/>
-        </w:rPr>
-      </w:pPr>
-      <w:r>
-        <w:rPr>
-          <w:rFonts w:ascii="Times New Roman" w:hAnsi="Times New Roman" w:cs="Times New Roman" w:hint="cs"/>
+          <w:rtl/>
+          <w:lang w:bidi="he-IL"/>
+        </w:rPr>
+        <w:t>עואודה</w:t>
+      </w:r>
+      <w:proofErr w:type="spellEnd"/>
+      <w:r>
+        <w:rPr>
+          <w:rFonts w:ascii="Times New Roman" w:hAnsi="Times New Roman" w:cs="Times New Roman"/>
           <w:b/>
           <w:bCs/>
           <w:i/>
           <w:iCs/>
           <w:sz w:val="32"/>
           <w:szCs w:val="32"/>
+          <w:rtl/>
+          <w:lang w:bidi="he-IL"/>
+        </w:rPr>
+        <w:t xml:space="preserve"> </w:t>
+      </w:r>
+      <w:r>
+        <w:rPr>
+          <w:rFonts w:ascii="Times New Roman" w:hAnsi="Times New Roman" w:cs="Times New Roman"/>
+          <w:b/>
+          <w:bCs/>
+          <w:i/>
+          <w:iCs/>
+          <w:sz w:val="32"/>
+          <w:szCs w:val="32"/>
+          <w:rtl/>
+          <w:lang w:bidi="he-IL"/>
+        </w:rPr>
+        <w:t>213474349</w:t>
+      </w:r>
+      <w:r>
+        <w:rPr>
+          <w:rFonts w:ascii="Times New Roman" w:hAnsi="Times New Roman" w:cs="Times New Roman" w:hint="cs"/>
+          <w:b/>
+          <w:bCs/>
+          <w:i/>
+          <w:iCs/>
+          <w:sz w:val="32"/>
+          <w:szCs w:val="32"/>
+          <w:rtl/>
+          <w:lang w:bidi="he-IL"/>
+        </w:rPr>
+        <w:t>.</w:t>
+      </w:r>
+    </w:p>
+    <w:p>
+      <w:pPr>
+        <w:bidi/>
+        <w:rPr>
+          <w:rFonts w:ascii="Times New Roman" w:hAnsi="Times New Roman" w:cs="Times New Roman"/>
+          <w:sz w:val="32"/>
+          <w:szCs w:val="32"/>
+          <w:lang w:bidi="he-IL"/>
+        </w:rPr>
+      </w:pPr>
+    </w:p>
+    <w:p>
+      <w:pPr>
+        <w:bidi/>
+        <w:rPr>
+          <w:rFonts w:ascii="Times New Roman" w:hAnsi="Times New Roman" w:cs="Times New Roman"/>
+          <w:b/>
+          <w:bCs/>
+          <w:i/>
+          <w:iCs/>
+          <w:sz w:val="32"/>
+          <w:szCs w:val="32"/>
+          <w:u w:val="single"/>
+          <w:rtl/>
+          <w:lang w:bidi="he-IL"/>
+        </w:rPr>
+      </w:pPr>
+      <w:r>
+        <w:rPr>
+          <w:rFonts w:ascii="Times New Roman" w:hAnsi="Times New Roman" w:cs="Times New Roman" w:hint="cs"/>
+          <w:b/>
+          <w:bCs/>
+          <w:i/>
+          <w:iCs/>
+          <w:sz w:val="32"/>
+          <w:szCs w:val="32"/>
           <w:highlight w:val="yellow"/>
           <w:u w:val="single"/>
           <w:rtl/>
@@ -217,7 +276,29 @@
           <w:rtl/>
           <w:lang w:bidi="he-IL"/>
         </w:rPr>
-        <w:t xml:space="preserve">כדי שנוכל לענות על השאלה איזה ארגמונטים אנחנו בוחרים למחלקה </w:t>
+        <w:t xml:space="preserve">כדי שנוכל לענות על השאלה איזה </w:t>
+      </w:r>
+      <w:proofErr w:type="spellStart"/>
+      <w:r>
+        <w:rPr>
+          <w:rFonts w:ascii="Times New Roman" w:hAnsi="Times New Roman" w:cs="Times New Roman" w:hint="cs"/>
+          <w:sz w:val="32"/>
+          <w:szCs w:val="32"/>
+          <w:rtl/>
+          <w:lang w:bidi="he-IL"/>
+        </w:rPr>
+        <w:t>ארגמונטים</w:t>
+      </w:r>
+      <w:proofErr w:type="spellEnd"/>
+      <w:r>
+        <w:rPr>
+          <w:rFonts w:ascii="Times New Roman" w:hAnsi="Times New Roman" w:cs="Times New Roman" w:hint="cs"/>
+          <w:sz w:val="32"/>
+          <w:szCs w:val="32"/>
+          <w:rtl/>
+          <w:lang w:bidi="he-IL"/>
+        </w:rPr>
+        <w:t xml:space="preserve"> אנחנו בוחרים למחלקה </w:t>
       </w:r>
       <w:r>
         <w:rPr>
@@ -240,7 +321,29 @@
           <w:rtl/>
           <w:lang w:bidi="he-IL"/>
         </w:rPr>
-        <w:t xml:space="preserve"> היינו צריכים קודם להבין מה כל ארגיומנט מיצג:</w:t>
+        <w:t xml:space="preserve"> היינו צריכים קודם להבין מה כל </w:t>
+      </w:r>
+      <w:proofErr w:type="spellStart"/>
+      <w:r>
+        <w:rPr>
+          <w:rFonts w:ascii="Times New Roman" w:hAnsi="Times New Roman" w:cs="Times New Roman" w:hint="cs"/>
+          <w:sz w:val="32"/>
+          <w:szCs w:val="32"/>
+          <w:rtl/>
+          <w:lang w:bidi="he-IL"/>
+        </w:rPr>
+        <w:t>ארגיומנט</w:t>
+      </w:r>
+      <w:proofErr w:type="spellEnd"/>
+      <w:r>
+        <w:rPr>
+          <w:rFonts w:ascii="Times New Roman" w:hAnsi="Times New Roman" w:cs="Times New Roman" w:hint="cs"/>
+          <w:sz w:val="32"/>
+          <w:szCs w:val="32"/>
+          <w:rtl/>
+          <w:lang w:bidi="he-IL"/>
+        </w:rPr>
+        <w:t xml:space="preserve"> מיצג:</w:t>
       </w:r>
     </w:p>
     <w:p>
@@ -263,6 +366,7 @@
           <w:lang w:bidi="he-IL"/>
         </w:rPr>
       </w:pPr>
+      <w:proofErr w:type="spellStart"/>
       <w:r>
         <w:rPr>
           <w:rFonts w:ascii="Times New Roman" w:hAnsi="Times New Roman" w:cs="Times New Roman"/>
@@ -276,6 +380,7 @@
         </w:rPr>
         <w:t>vector_size</w:t>
       </w:r>
+      <w:proofErr w:type="spellEnd"/>
       <w:r>
         <w:rPr>
           <w:rFonts w:ascii="Times New Roman" w:hAnsi="Times New Roman" w:cs="Times New Roman" w:hint="cs"/>
@@ -304,6 +409,7 @@
           <w:lang w:bidi="he-IL"/>
         </w:rPr>
       </w:pPr>
+      <w:proofErr w:type="spellStart"/>
       <w:r>
         <w:rPr>
           <w:rFonts w:ascii="Times New Roman" w:hAnsi="Times New Roman" w:cs="Times New Roman" w:hint="cs"/>
@@ -312,7 +418,40 @@
           <w:rtl/>
           <w:lang w:bidi="he-IL"/>
         </w:rPr>
-        <w:t>המימד של הוקטור.</w:t>
+        <w:t>המימד</w:t>
+      </w:r>
+      <w:proofErr w:type="spellEnd"/>
+      <w:r>
+        <w:rPr>
+          <w:rFonts w:ascii="Times New Roman" w:hAnsi="Times New Roman" w:cs="Times New Roman" w:hint="cs"/>
+          <w:sz w:val="32"/>
+          <w:szCs w:val="32"/>
+          <w:rtl/>
+          <w:lang w:bidi="he-IL"/>
+        </w:rPr>
+        <w:t xml:space="preserve"> של </w:t>
+      </w:r>
+      <w:proofErr w:type="spellStart"/>
+      <w:r>
+        <w:rPr>
+          <w:rFonts w:ascii="Times New Roman" w:hAnsi="Times New Roman" w:cs="Times New Roman" w:hint="cs"/>
+          <w:sz w:val="32"/>
+          <w:szCs w:val="32"/>
+          <w:rtl/>
+          <w:lang w:bidi="he-IL"/>
+        </w:rPr>
+        <w:t>הוקטור</w:t>
+      </w:r>
+      <w:proofErr w:type="spellEnd"/>
+      <w:r>
+        <w:rPr>
+          <w:rFonts w:ascii="Times New Roman" w:hAnsi="Times New Roman" w:cs="Times New Roman" w:hint="cs"/>
+          <w:sz w:val="32"/>
+          <w:szCs w:val="32"/>
+          <w:rtl/>
+          <w:lang w:bidi="he-IL"/>
+        </w:rPr>
+        <w:t>.</w:t>
       </w:r>
     </w:p>
     <w:p>
@@ -415,6 +554,7 @@
           <w:lang w:bidi="he-IL"/>
         </w:rPr>
       </w:pPr>
+      <w:proofErr w:type="spellStart"/>
       <w:r>
         <w:rPr>
           <w:rFonts w:ascii="Times New Roman" w:hAnsi="Times New Roman" w:cs="Times New Roman"/>
@@ -428,6 +568,7 @@
         </w:rPr>
         <w:t>min_count</w:t>
       </w:r>
+      <w:proofErr w:type="spellEnd"/>
       <w:r>
         <w:rPr>
           <w:rFonts w:ascii="Times New Roman" w:hAnsi="Times New Roman" w:cs="Times New Roman" w:hint="cs"/>
@@ -529,6 +670,7 @@
         </w:rPr>
         <w:t xml:space="preserve"> (</w:t>
       </w:r>
+      <w:proofErr w:type="spellStart"/>
       <w:r>
         <w:rPr>
           <w:rFonts w:ascii="Times New Roman" w:hAnsi="Times New Roman" w:cs="Times New Roman"/>
@@ -557,6 +699,7 @@
         </w:rPr>
         <w:t>e</w:t>
       </w:r>
+      <w:proofErr w:type="spellEnd"/>
       <w:r>
         <w:rPr>
           <w:rFonts w:ascii="Times New Roman" w:hAnsi="Times New Roman" w:cs="Times New Roman"/>
@@ -611,6 +754,7 @@
         </w:rPr>
         <w:t xml:space="preserve"> </w:t>
       </w:r>
+      <w:proofErr w:type="spellStart"/>
       <w:r>
         <w:rPr>
           <w:rFonts w:ascii="Times New Roman" w:hAnsi="Times New Roman" w:cs="Times New Roman"/>
@@ -637,6 +781,7 @@
         </w:rPr>
         <w:t>e</w:t>
       </w:r>
+      <w:proofErr w:type="spellEnd"/>
       <w:r>
         <w:rPr>
           <w:rFonts w:ascii="Times New Roman" w:hAnsi="Times New Roman" w:cs="Times New Roman"/>
@@ -781,7 +926,51 @@
           <w:rtl/>
           <w:lang w:bidi="he-IL"/>
         </w:rPr>
-        <w:t>הסיבה לכך היא גודלו המצומצם של הקורפוס (כ-1.3 מיליון מילים) ביחס לגודל אוצר המילים הגדול שנוצר עקב היעדר למטיזציה (כ-78 אלף מילים). חישוב פשוט מראה ששימוש בוקטורים גדולים יותר (למשל 100 או 300) היה יוצר מודל עם מיליוני פרמטרים שאין מספיק דאטה כדי לאמן אותם ביציבות</w:t>
+        <w:t xml:space="preserve">הסיבה לכך היא גודלו המצומצם של הקורפוס (כ-1.3 מיליון מילים) ביחס לגודל אוצר המילים הגדול שנוצר עקב היעדר </w:t>
+      </w:r>
+      <w:proofErr w:type="spellStart"/>
+      <w:r>
+        <w:rPr>
+          <w:rFonts w:ascii="Times New Roman" w:hAnsi="Times New Roman" w:cs="Times New Roman"/>
+          <w:sz w:val="32"/>
+          <w:szCs w:val="32"/>
+          <w:rtl/>
+          <w:lang w:bidi="he-IL"/>
+        </w:rPr>
+        <w:t>למטיזציה</w:t>
+      </w:r>
+      <w:proofErr w:type="spellEnd"/>
+      <w:r>
+        <w:rPr>
+          <w:rFonts w:ascii="Times New Roman" w:hAnsi="Times New Roman" w:cs="Times New Roman"/>
+          <w:sz w:val="32"/>
+          <w:szCs w:val="32"/>
+          <w:rtl/>
+          <w:lang w:bidi="he-IL"/>
+        </w:rPr>
+        <w:t xml:space="preserve"> (כ-78 אלף מילים). חישוב פשוט מראה ששימוש </w:t>
+      </w:r>
+      <w:proofErr w:type="spellStart"/>
+      <w:r>
+        <w:rPr>
+          <w:rFonts w:ascii="Times New Roman" w:hAnsi="Times New Roman" w:cs="Times New Roman"/>
+          <w:sz w:val="32"/>
+          <w:szCs w:val="32"/>
+          <w:rtl/>
+          <w:lang w:bidi="he-IL"/>
+        </w:rPr>
+        <w:t>בוקטורים</w:t>
+      </w:r>
+      <w:proofErr w:type="spellEnd"/>
+      <w:r>
+        <w:rPr>
+          <w:rFonts w:ascii="Times New Roman" w:hAnsi="Times New Roman" w:cs="Times New Roman"/>
+          <w:sz w:val="32"/>
+          <w:szCs w:val="32"/>
+          <w:rtl/>
+          <w:lang w:bidi="he-IL"/>
+        </w:rPr>
+        <w:t xml:space="preserve"> גדולים יותר (למשל 100 או 300) היה יוצר מודל עם מיליוני פרמטרים שאין מספיק דאטה כדי לאמן אותם ביציבות</w:t>
       </w:r>
       <w:r>
         <w:rPr>
@@ -1590,6 +1779,7 @@
         </w:rPr>
         <w:t>וח</w:t>
       </w:r>
+      <w:proofErr w:type="spellStart"/>
       <w:r>
         <w:rPr>
           <w:rFonts w:ascii="Times New Roman" w:hAnsi="Times New Roman" w:cs="Times New Roman"/>
@@ -1600,7 +1790,20 @@
           <w:u w:val="single"/>
           <w:lang w:bidi="he-IL"/>
         </w:rPr>
-        <w:t xml:space="preserve">min_count </w:t>
+        <w:t>min_count</w:t>
+      </w:r>
+      <w:proofErr w:type="spellEnd"/>
+      <w:r>
+        <w:rPr>
+          <w:rFonts w:ascii="Times New Roman" w:hAnsi="Times New Roman" w:cs="Times New Roman"/>
+          <w:b/>
+          <w:bCs/>
+          <w:sz w:val="32"/>
+          <w:szCs w:val="32"/>
+          <w:u w:val="single"/>
+          <w:lang w:bidi="he-IL"/>
+        </w:rPr>
+        <w:t xml:space="preserve"> </w:t>
       </w:r>
     </w:p>
     <w:p>
@@ -1634,6 +1837,7 @@
         </w:rPr>
         <w:t xml:space="preserve"> </w:t>
       </w:r>
+      <w:proofErr w:type="spellStart"/>
       <w:r>
         <w:rPr>
           <w:rFonts w:ascii="Times New Roman" w:hAnsi="Times New Roman" w:cs="Times New Roman"/>
@@ -1643,6 +1847,7 @@
         </w:rPr>
         <w:t>min_count</w:t>
       </w:r>
+      <w:proofErr w:type="spellEnd"/>
       <w:r>
         <w:rPr>
           <w:rFonts w:ascii="Times New Roman" w:hAnsi="Times New Roman" w:cs="Times New Roman"/>
@@ -1734,8 +1939,20 @@
           <w:rtl/>
           <w:lang w:bidi="he-IL"/>
         </w:rPr>
-        <w:t>בחרנו בערך 1 כדי להבטיח שכל מילה שהופיעה בקורפוס, ולו פעם אחת, תקבל ייצוג וקטורי</w:t>
-      </w:r>
+        <w:t xml:space="preserve">בחרנו בערך 1 כדי להבטיח שכל מילה שהופיעה בקורפוס, ולו פעם אחת, תקבל ייצוג </w:t>
+      </w:r>
+      <w:proofErr w:type="spellStart"/>
+      <w:r>
+        <w:rPr>
+          <w:rFonts w:ascii="Times New Roman" w:hAnsi="Times New Roman" w:cs="Times New Roman"/>
+          <w:sz w:val="32"/>
+          <w:szCs w:val="32"/>
+          <w:rtl/>
+          <w:lang w:bidi="he-IL"/>
+        </w:rPr>
+        <w:t>וקטורי</w:t>
+      </w:r>
+      <w:proofErr w:type="spellEnd"/>
       <w:r>
         <w:rPr>
           <w:rFonts w:ascii="Times New Roman" w:hAnsi="Times New Roman" w:cs="Times New Roman"/>
@@ -1898,15 +2115,12 @@
           <w:rtl/>
           <w:lang w:bidi="he-IL"/>
         </w:rPr>
-        <w:t xml:space="preserve"> בספרות (מחקרים באנטרנט)</w:t>
-      </w:r>
-    </w:p>
-    <w:p>
-      <w:pPr>
-        <w:pStyle w:val="ListParagraph"/>
-        <w:bidi/>
-        <w:rPr>
-          <w:rFonts w:ascii="Times New Roman" w:hAnsi="Times New Roman" w:cs="Times New Roman"/>
+        <w:t xml:space="preserve"> בספרות (מחקרים </w:t>
+      </w:r>
+      <w:proofErr w:type="spellStart"/>
+      <w:r>
+        <w:rPr>
+          <w:rFonts w:ascii="Times New Roman" w:hAnsi="Times New Roman" w:cs="Times New Roman" w:hint="cs"/>
           <w:b/>
           <w:bCs/>
           <w:i/>
@@ -1917,14 +2131,12 @@
           <w:rtl/>
           <w:lang w:bidi="he-IL"/>
         </w:rPr>
-      </w:pPr>
-    </w:p>
-    <w:p>
-      <w:pPr>
-        <w:pStyle w:val="ListParagraph"/>
-        <w:bidi/>
-        <w:rPr>
-          <w:rFonts w:ascii="Times New Roman" w:hAnsi="Times New Roman" w:cs="Times New Roman"/>
+        <w:t>באנטרנט</w:t>
+      </w:r>
+      <w:proofErr w:type="spellEnd"/>
+      <w:r>
+        <w:rPr>
+          <w:rFonts w:ascii="Times New Roman" w:hAnsi="Times New Roman" w:cs="Times New Roman" w:hint="cs"/>
           <w:b/>
           <w:bCs/>
           <w:i/>
@@ -1935,16 +2147,53 @@
           <w:rtl/>
           <w:lang w:bidi="he-IL"/>
         </w:rPr>
-      </w:pPr>
-      <w:r>
-        <w:rPr>
-          <w:rFonts w:ascii="Times New Roman" w:hAnsi="Times New Roman" w:cs="Times New Roman" w:hint="cs"/>
+        <w:t>)</w:t>
+      </w:r>
+    </w:p>
+    <w:p>
+      <w:pPr>
+        <w:pStyle w:val="ListParagraph"/>
+        <w:bidi/>
+        <w:rPr>
+          <w:rFonts w:ascii="Times New Roman" w:hAnsi="Times New Roman" w:cs="Times New Roman"/>
           <w:b/>
           <w:bCs/>
           <w:i/>
           <w:iCs/>
           <w:sz w:val="32"/>
           <w:szCs w:val="32"/>
+          <w:u w:val="single"/>
+          <w:rtl/>
+          <w:lang w:bidi="he-IL"/>
+        </w:rPr>
+      </w:pPr>
+    </w:p>
+    <w:p>
+      <w:pPr>
+        <w:pStyle w:val="ListParagraph"/>
+        <w:bidi/>
+        <w:rPr>
+          <w:rFonts w:ascii="Times New Roman" w:hAnsi="Times New Roman" w:cs="Times New Roman"/>
+          <w:b/>
+          <w:bCs/>
+          <w:i/>
+          <w:iCs/>
+          <w:sz w:val="32"/>
+          <w:szCs w:val="32"/>
+          <w:u w:val="single"/>
+          <w:rtl/>
+          <w:lang w:bidi="he-IL"/>
+        </w:rPr>
+      </w:pPr>
+      <w:r>
+        <w:rPr>
+          <w:rFonts w:ascii="Times New Roman" w:hAnsi="Times New Roman" w:cs="Times New Roman" w:hint="cs"/>
+          <w:b/>
+          <w:bCs/>
+          <w:i/>
+          <w:iCs/>
+          <w:sz w:val="32"/>
+          <w:szCs w:val="32"/>
           <w:highlight w:val="yellow"/>
           <w:u w:val="single"/>
           <w:rtl/>
@@ -2000,17 +2249,59 @@
           <w:szCs w:val="32"/>
           <w:lang w:bidi="he-IL"/>
         </w:rPr>
-        <w:t xml:space="preserve"> vector_size </w:t>
-      </w:r>
-      <w:r>
-        <w:rPr>
-          <w:rFonts w:ascii="Times New Roman" w:hAnsi="Times New Roman" w:cs="Times New Roman"/>
-          <w:sz w:val="32"/>
-          <w:szCs w:val="32"/>
-          <w:rtl/>
-          <w:lang w:bidi="he-IL"/>
-        </w:rPr>
-        <w:t>מגדיר את ממדיות המרחב הווקטורי, או במילים אחרות, את מספר הנוירונים בשכבה החבויה של הרשת העצבית</w:t>
+        <w:t xml:space="preserve"> </w:t>
+      </w:r>
+      <w:proofErr w:type="spellStart"/>
+      <w:r>
+        <w:rPr>
+          <w:rFonts w:ascii="Times New Roman" w:hAnsi="Times New Roman" w:cs="Times New Roman"/>
+          <w:sz w:val="32"/>
+          <w:szCs w:val="32"/>
+          <w:lang w:bidi="he-IL"/>
+        </w:rPr>
+        <w:t>vector_size</w:t>
+      </w:r>
+      <w:proofErr w:type="spellEnd"/>
+      <w:r>
+        <w:rPr>
+          <w:rFonts w:ascii="Times New Roman" w:hAnsi="Times New Roman" w:cs="Times New Roman"/>
+          <w:sz w:val="32"/>
+          <w:szCs w:val="32"/>
+          <w:lang w:bidi="he-IL"/>
+        </w:rPr>
+        <w:t xml:space="preserve"> </w:t>
+      </w:r>
+      <w:r>
+        <w:rPr>
+          <w:rFonts w:ascii="Times New Roman" w:hAnsi="Times New Roman" w:cs="Times New Roman"/>
+          <w:sz w:val="32"/>
+          <w:szCs w:val="32"/>
+          <w:rtl/>
+          <w:lang w:bidi="he-IL"/>
+        </w:rPr>
+        <w:t xml:space="preserve">מגדיר את ממדיות המרחב </w:t>
+      </w:r>
+      <w:proofErr w:type="spellStart"/>
+      <w:r>
+        <w:rPr>
+          <w:rFonts w:ascii="Times New Roman" w:hAnsi="Times New Roman" w:cs="Times New Roman"/>
+          <w:sz w:val="32"/>
+          <w:szCs w:val="32"/>
+          <w:rtl/>
+          <w:lang w:bidi="he-IL"/>
+        </w:rPr>
+        <w:t>הווקטורי</w:t>
+      </w:r>
+      <w:proofErr w:type="spellEnd"/>
+      <w:r>
+        <w:rPr>
+          <w:rFonts w:ascii="Times New Roman" w:hAnsi="Times New Roman" w:cs="Times New Roman"/>
+          <w:sz w:val="32"/>
+          <w:szCs w:val="32"/>
+          <w:rtl/>
+          <w:lang w:bidi="he-IL"/>
+        </w:rPr>
+        <w:t>, או במילים אחרות, את מספר הנוירונים בשכבה החבויה של הרשת העצבית</w:t>
       </w:r>
       <w:r>
         <w:rPr>
@@ -2060,26 +2351,92 @@
           <w:rtl/>
           <w:lang w:bidi="he-IL"/>
         </w:rPr>
-        <w:t>כל מימד בוקטור הסופי מייצג תכונה</w:t>
-      </w:r>
-      <w:r>
-        <w:rPr>
-          <w:rFonts w:ascii="Times New Roman" w:hAnsi="Times New Roman" w:cs="Times New Roman"/>
-          <w:sz w:val="32"/>
-          <w:szCs w:val="32"/>
+        <w:t xml:space="preserve">כל </w:t>
+      </w:r>
+      <w:proofErr w:type="spellStart"/>
+      <w:r>
+        <w:rPr>
+          <w:rFonts w:ascii="Times New Roman" w:hAnsi="Times New Roman" w:cs="Times New Roman"/>
+          <w:sz w:val="32"/>
+          <w:szCs w:val="32"/>
+          <w:rtl/>
+          <w:lang w:bidi="he-IL"/>
+        </w:rPr>
+        <w:t>מימד</w:t>
+      </w:r>
+      <w:proofErr w:type="spellEnd"/>
+      <w:r>
+        <w:rPr>
+          <w:rFonts w:ascii="Times New Roman" w:hAnsi="Times New Roman" w:cs="Times New Roman"/>
+          <w:sz w:val="32"/>
+          <w:szCs w:val="32"/>
+          <w:rtl/>
           <w:lang w:bidi="he-IL"/>
         </w:rPr>
         <w:t xml:space="preserve"> </w:t>
       </w:r>
-      <w:r>
-        <w:rPr>
-          <w:rFonts w:ascii="Times New Roman" w:hAnsi="Times New Roman" w:cs="Times New Roman"/>
-          <w:sz w:val="32"/>
-          <w:szCs w:val="32"/>
-          <w:rtl/>
-          <w:lang w:bidi="he-IL"/>
-        </w:rPr>
-        <w:t xml:space="preserve">חבויה של המילה, שנלמדה מתוך ההקשרים שבהם היא מופיעה בטקסט. ככל שיש יותר מימדים, למודל יש </w:t>
+      <w:proofErr w:type="spellStart"/>
+      <w:r>
+        <w:rPr>
+          <w:rFonts w:ascii="Times New Roman" w:hAnsi="Times New Roman" w:cs="Times New Roman"/>
+          <w:sz w:val="32"/>
+          <w:szCs w:val="32"/>
+          <w:rtl/>
+          <w:lang w:bidi="he-IL"/>
+        </w:rPr>
+        <w:t>בוקטור</w:t>
+      </w:r>
+      <w:proofErr w:type="spellEnd"/>
+      <w:r>
+        <w:rPr>
+          <w:rFonts w:ascii="Times New Roman" w:hAnsi="Times New Roman" w:cs="Times New Roman"/>
+          <w:sz w:val="32"/>
+          <w:szCs w:val="32"/>
+          <w:rtl/>
+          <w:lang w:bidi="he-IL"/>
+        </w:rPr>
+        <w:t xml:space="preserve"> הסופי מייצג תכונה</w:t>
+      </w:r>
+      <w:r>
+        <w:rPr>
+          <w:rFonts w:ascii="Times New Roman" w:hAnsi="Times New Roman" w:cs="Times New Roman"/>
+          <w:sz w:val="32"/>
+          <w:szCs w:val="32"/>
+          <w:lang w:bidi="he-IL"/>
+        </w:rPr>
+        <w:t xml:space="preserve"> </w:t>
+      </w:r>
+      <w:r>
+        <w:rPr>
+          <w:rFonts w:ascii="Times New Roman" w:hAnsi="Times New Roman" w:cs="Times New Roman"/>
+          <w:sz w:val="32"/>
+          <w:szCs w:val="32"/>
+          <w:rtl/>
+          <w:lang w:bidi="he-IL"/>
+        </w:rPr>
+        <w:t xml:space="preserve">חבויה של המילה, שנלמדה מתוך ההקשרים שבהם היא מופיעה בטקסט. ככל שיש יותר </w:t>
+      </w:r>
+      <w:proofErr w:type="spellStart"/>
+      <w:r>
+        <w:rPr>
+          <w:rFonts w:ascii="Times New Roman" w:hAnsi="Times New Roman" w:cs="Times New Roman"/>
+          <w:sz w:val="32"/>
+          <w:szCs w:val="32"/>
+          <w:rtl/>
+          <w:lang w:bidi="he-IL"/>
+        </w:rPr>
+        <w:t>מימדים</w:t>
+      </w:r>
+      <w:proofErr w:type="spellEnd"/>
+      <w:r>
+        <w:rPr>
+          <w:rFonts w:ascii="Times New Roman" w:hAnsi="Times New Roman" w:cs="Times New Roman"/>
+          <w:sz w:val="32"/>
+          <w:szCs w:val="32"/>
+          <w:rtl/>
+          <w:lang w:bidi="he-IL"/>
+        </w:rPr>
+        <w:t xml:space="preserve">, למודל יש </w:t>
       </w:r>
       <w:r>
         <w:rPr>
@@ -2166,7 +2523,33 @@
           <w:rtl/>
           <w:lang w:bidi="he-IL"/>
         </w:rPr>
-        <w:t>הגדלת גודל הוקטור (למשל: 100-300 ומעלה)</w:t>
+        <w:t xml:space="preserve">הגדלת גודל </w:t>
+      </w:r>
+      <w:proofErr w:type="spellStart"/>
+      <w:r>
+        <w:rPr>
+          <w:rFonts w:ascii="Times New Roman" w:hAnsi="Times New Roman" w:cs="Times New Roman"/>
+          <w:b/>
+          <w:bCs/>
+          <w:sz w:val="32"/>
+          <w:szCs w:val="32"/>
+          <w:rtl/>
+          <w:lang w:bidi="he-IL"/>
+        </w:rPr>
+        <w:t>הוקטור</w:t>
+      </w:r>
+      <w:proofErr w:type="spellEnd"/>
+      <w:r>
+        <w:rPr>
+          <w:rFonts w:ascii="Times New Roman" w:hAnsi="Times New Roman" w:cs="Times New Roman"/>
+          <w:b/>
+          <w:bCs/>
+          <w:sz w:val="32"/>
+          <w:szCs w:val="32"/>
+          <w:rtl/>
+          <w:lang w:bidi="he-IL"/>
+        </w:rPr>
+        <w:t xml:space="preserve"> (למשל: 100-300 ומעלה)</w:t>
       </w:r>
     </w:p>
     <w:p>
@@ -2415,7 +2798,29 @@
           <w:rtl/>
           <w:lang w:bidi="he-IL"/>
         </w:rPr>
-        <w:t>שם יש מספיק דאטה כדי למלא את המימדים הללו במידע משמעותי</w:t>
+        <w:t xml:space="preserve">שם יש מספיק דאטה כדי למלא את </w:t>
+      </w:r>
+      <w:proofErr w:type="spellStart"/>
+      <w:r>
+        <w:rPr>
+          <w:rFonts w:ascii="Times New Roman" w:hAnsi="Times New Roman" w:cs="Times New Roman"/>
+          <w:sz w:val="32"/>
+          <w:szCs w:val="32"/>
+          <w:rtl/>
+          <w:lang w:bidi="he-IL"/>
+        </w:rPr>
+        <w:t>המימדים</w:t>
+      </w:r>
+      <w:proofErr w:type="spellEnd"/>
+      <w:r>
+        <w:rPr>
+          <w:rFonts w:ascii="Times New Roman" w:hAnsi="Times New Roman" w:cs="Times New Roman"/>
+          <w:sz w:val="32"/>
+          <w:szCs w:val="32"/>
+          <w:rtl/>
+          <w:lang w:bidi="he-IL"/>
+        </w:rPr>
+        <w:t xml:space="preserve"> הללו במידע משמעותי</w:t>
       </w:r>
       <w:r>
         <w:rPr>
@@ -2518,7 +2923,29 @@
           <w:rtl/>
           <w:lang w:bidi="he-IL"/>
         </w:rPr>
-        <w:t>הגדלת המימד מגדילה ליניארית את דרישות הזיכרון</w:t>
+        <w:t xml:space="preserve">הגדלת </w:t>
+      </w:r>
+      <w:proofErr w:type="spellStart"/>
+      <w:r>
+        <w:rPr>
+          <w:rFonts w:ascii="Times New Roman" w:hAnsi="Times New Roman" w:cs="Times New Roman"/>
+          <w:sz w:val="32"/>
+          <w:szCs w:val="32"/>
+          <w:rtl/>
+          <w:lang w:bidi="he-IL"/>
+        </w:rPr>
+        <w:t>המימד</w:t>
+      </w:r>
+      <w:proofErr w:type="spellEnd"/>
+      <w:r>
+        <w:rPr>
+          <w:rFonts w:ascii="Times New Roman" w:hAnsi="Times New Roman" w:cs="Times New Roman"/>
+          <w:sz w:val="32"/>
+          <w:szCs w:val="32"/>
+          <w:rtl/>
+          <w:lang w:bidi="he-IL"/>
+        </w:rPr>
+        <w:t xml:space="preserve"> מגדילה ליניארית את דרישות הזיכרון</w:t>
       </w:r>
       <w:r>
         <w:rPr>
@@ -2700,7 +3127,33 @@
           <w:rtl/>
           <w:lang w:bidi="he-IL"/>
         </w:rPr>
-        <w:t>הקטנת גודל הוקטור (למשל: 50)</w:t>
+        <w:t xml:space="preserve">הקטנת גודל </w:t>
+      </w:r>
+      <w:proofErr w:type="spellStart"/>
+      <w:r>
+        <w:rPr>
+          <w:rFonts w:ascii="Times New Roman" w:hAnsi="Times New Roman" w:cs="Times New Roman"/>
+          <w:b/>
+          <w:bCs/>
+          <w:sz w:val="32"/>
+          <w:szCs w:val="32"/>
+          <w:rtl/>
+          <w:lang w:bidi="he-IL"/>
+        </w:rPr>
+        <w:t>הוקטור</w:t>
+      </w:r>
+      <w:proofErr w:type="spellEnd"/>
+      <w:r>
+        <w:rPr>
+          <w:rFonts w:ascii="Times New Roman" w:hAnsi="Times New Roman" w:cs="Times New Roman"/>
+          <w:b/>
+          <w:bCs/>
+          <w:sz w:val="32"/>
+          <w:szCs w:val="32"/>
+          <w:rtl/>
+          <w:lang w:bidi="he-IL"/>
+        </w:rPr>
+        <w:t xml:space="preserve"> (למשל: 50)</w:t>
       </w:r>
     </w:p>
     <w:p>
@@ -2918,7 +3371,29 @@
           <w:rtl/>
           <w:lang w:bidi="he-IL"/>
         </w:rPr>
-        <w:t>בקורפוסים קטנים מאוד, מימד נמוך מאלץ את המודל להתמקד רק בתכונות החזקות והחשובות ביותר של השפה</w:t>
+        <w:t xml:space="preserve">בקורפוסים קטנים מאוד, </w:t>
+      </w:r>
+      <w:proofErr w:type="spellStart"/>
+      <w:r>
+        <w:rPr>
+          <w:rFonts w:ascii="Times New Roman" w:hAnsi="Times New Roman" w:cs="Times New Roman"/>
+          <w:sz w:val="32"/>
+          <w:szCs w:val="32"/>
+          <w:rtl/>
+          <w:lang w:bidi="he-IL"/>
+        </w:rPr>
+        <w:t>מימד</w:t>
+      </w:r>
+      <w:proofErr w:type="spellEnd"/>
+      <w:r>
+        <w:rPr>
+          <w:rFonts w:ascii="Times New Roman" w:hAnsi="Times New Roman" w:cs="Times New Roman"/>
+          <w:sz w:val="32"/>
+          <w:szCs w:val="32"/>
+          <w:rtl/>
+          <w:lang w:bidi="he-IL"/>
+        </w:rPr>
+        <w:t xml:space="preserve"> נמוך מאלץ את המודל להתמקד רק בתכונות החזקות והחשובות ביותר של השפה</w:t>
       </w:r>
       <w:r>
         <w:rPr>
@@ -3016,15 +3491,27 @@
         </w:rPr>
         <w:t xml:space="preserve"> </w:t>
       </w:r>
-      <w:r>
-        <w:rPr>
-          <w:rFonts w:ascii="Times New Roman" w:hAnsi="Times New Roman" w:cs="Times New Roman"/>
-          <w:sz w:val="32"/>
-          <w:szCs w:val="32"/>
-          <w:rtl/>
-          <w:lang w:bidi="he-IL"/>
-        </w:rPr>
-        <w:t>במימד נמוך מדי, המודל לא מצליח לקודד את כל הקשרים הסמנטיים המורכבים. מילים בעלות משמעות שונה עלולות לקבל ייצוגים דומים מדי ("קורסות" לאותו אזור במרחב) בגלל חוסר "מקום" לייצג את השוני ביניהן</w:t>
+      <w:proofErr w:type="spellStart"/>
+      <w:r>
+        <w:rPr>
+          <w:rFonts w:ascii="Times New Roman" w:hAnsi="Times New Roman" w:cs="Times New Roman"/>
+          <w:sz w:val="32"/>
+          <w:szCs w:val="32"/>
+          <w:rtl/>
+          <w:lang w:bidi="he-IL"/>
+        </w:rPr>
+        <w:t>במימד</w:t>
+      </w:r>
+      <w:proofErr w:type="spellEnd"/>
+      <w:r>
+        <w:rPr>
+          <w:rFonts w:ascii="Times New Roman" w:hAnsi="Times New Roman" w:cs="Times New Roman"/>
+          <w:sz w:val="32"/>
+          <w:szCs w:val="32"/>
+          <w:rtl/>
+          <w:lang w:bidi="he-IL"/>
+        </w:rPr>
+        <w:t xml:space="preserve"> נמוך מדי, המודל לא מצליח לקודד את כל הקשרים הסמנטיים המורכבים. מילים בעלות משמעות שונה עלולות לקבל ייצוגים דומים מדי ("קורסות" לאותו אזור במרחב) בגלל חוסר "מקום" לייצג את השוני ביניהן</w:t>
       </w:r>
       <w:r>
         <w:rPr>
@@ -3092,7 +3579,51 @@
           <w:rtl/>
           <w:lang w:bidi="he-IL"/>
         </w:rPr>
-        <w:t>היכולת לבצע אריתמטיקה וקטורית (כמו בדוגמה הקלאסית: מלך - גבר + אישה = מלכה) נפגעת משמעותית כאשר המימד נמוך מדי</w:t>
+        <w:t xml:space="preserve">היכולת לבצע אריתמטיקה </w:t>
+      </w:r>
+      <w:proofErr w:type="spellStart"/>
+      <w:r>
+        <w:rPr>
+          <w:rFonts w:ascii="Times New Roman" w:hAnsi="Times New Roman" w:cs="Times New Roman"/>
+          <w:sz w:val="32"/>
+          <w:szCs w:val="32"/>
+          <w:rtl/>
+          <w:lang w:bidi="he-IL"/>
+        </w:rPr>
+        <w:t>וקטורית</w:t>
+      </w:r>
+      <w:proofErr w:type="spellEnd"/>
+      <w:r>
+        <w:rPr>
+          <w:rFonts w:ascii="Times New Roman" w:hAnsi="Times New Roman" w:cs="Times New Roman"/>
+          <w:sz w:val="32"/>
+          <w:szCs w:val="32"/>
+          <w:rtl/>
+          <w:lang w:bidi="he-IL"/>
+        </w:rPr>
+        <w:t xml:space="preserve"> (כמו בדוגמה הקלאסית: מלך - גבר + אישה = מלכה) נפגעת משמעותית כאשר </w:t>
+      </w:r>
+      <w:proofErr w:type="spellStart"/>
+      <w:r>
+        <w:rPr>
+          <w:rFonts w:ascii="Times New Roman" w:hAnsi="Times New Roman" w:cs="Times New Roman"/>
+          <w:sz w:val="32"/>
+          <w:szCs w:val="32"/>
+          <w:rtl/>
+          <w:lang w:bidi="he-IL"/>
+        </w:rPr>
+        <w:t>המימד</w:t>
+      </w:r>
+      <w:proofErr w:type="spellEnd"/>
+      <w:r>
+        <w:rPr>
+          <w:rFonts w:ascii="Times New Roman" w:hAnsi="Times New Roman" w:cs="Times New Roman"/>
+          <w:sz w:val="32"/>
+          <w:szCs w:val="32"/>
+          <w:rtl/>
+          <w:lang w:bidi="he-IL"/>
+        </w:rPr>
+        <w:t xml:space="preserve"> נמוך מדי</w:t>
       </w:r>
       <w:r>
         <w:rPr>
@@ -3282,8 +3813,22 @@
           <w:rtl/>
           <w:lang w:bidi="he-IL"/>
         </w:rPr>
-        <w:t>א. אופן יצירת הקורפוס: בעיית המורפולוגיה והטוקניזציה</w:t>
-      </w:r>
+        <w:t xml:space="preserve">א. אופן יצירת הקורפוס: בעיית המורפולוגיה </w:t>
+      </w:r>
+      <w:proofErr w:type="spellStart"/>
+      <w:r>
+        <w:rPr>
+          <w:rFonts w:ascii="Times New Roman" w:hAnsi="Times New Roman" w:cs="Times New Roman"/>
+          <w:b/>
+          <w:bCs/>
+          <w:sz w:val="32"/>
+          <w:szCs w:val="32"/>
+          <w:rtl/>
+          <w:lang w:bidi="he-IL"/>
+        </w:rPr>
+        <w:t>והטוקניזציה</w:t>
+      </w:r>
+      <w:proofErr w:type="spellEnd"/>
     </w:p>
     <w:p>
       <w:pPr>
@@ -3304,7 +3849,29 @@
           <w:rtl/>
           <w:lang w:bidi="he-IL"/>
         </w:rPr>
-        <w:t xml:space="preserve">הקורפוס נוצר באמצעות טוקניזציה "נאיבית" (הפרדה לפי רווחים והסרת </w:t>
+        <w:t xml:space="preserve">הקורפוס נוצר באמצעות </w:t>
+      </w:r>
+      <w:proofErr w:type="spellStart"/>
+      <w:r>
+        <w:rPr>
+          <w:rFonts w:ascii="Times New Roman" w:hAnsi="Times New Roman" w:cs="Times New Roman"/>
+          <w:sz w:val="32"/>
+          <w:szCs w:val="32"/>
+          <w:rtl/>
+          <w:lang w:bidi="he-IL"/>
+        </w:rPr>
+        <w:t>טוקניזציה</w:t>
+      </w:r>
+      <w:proofErr w:type="spellEnd"/>
+      <w:r>
+        <w:rPr>
+          <w:rFonts w:ascii="Times New Roman" w:hAnsi="Times New Roman" w:cs="Times New Roman"/>
+          <w:sz w:val="32"/>
+          <w:szCs w:val="32"/>
+          <w:rtl/>
+          <w:lang w:bidi="he-IL"/>
+        </w:rPr>
+        <w:t xml:space="preserve"> "נאיבית" (הפרדה לפי רווחים והסרת </w:t>
       </w:r>
       <w:r>
         <w:rPr>
@@ -3378,7 +3945,29 @@
           <w:rtl/>
           <w:lang w:bidi="he-IL"/>
         </w:rPr>
-        <w:t>עברית היא שפה עשירה מורפולוגית. מילה כמו "בית" יכולה להופיע כ-"הבית", "בבית", "וכשבבית" וכו'. המודל הנוכחי מתייחס לכל אחת מהן כאל מילה נפרדת לחלוטין</w:t>
+        <w:t xml:space="preserve">עברית היא שפה עשירה מורפולוגית. מילה כמו "בית" יכולה להופיע כ-"הבית", "בבית", "וכשבבית" </w:t>
+      </w:r>
+      <w:proofErr w:type="spellStart"/>
+      <w:r>
+        <w:rPr>
+          <w:rFonts w:ascii="Times New Roman" w:hAnsi="Times New Roman" w:cs="Times New Roman"/>
+          <w:sz w:val="32"/>
+          <w:szCs w:val="32"/>
+          <w:rtl/>
+          <w:lang w:bidi="he-IL"/>
+        </w:rPr>
+        <w:t>וכו</w:t>
+      </w:r>
+      <w:proofErr w:type="spellEnd"/>
+      <w:r>
+        <w:rPr>
+          <w:rFonts w:ascii="Times New Roman" w:hAnsi="Times New Roman" w:cs="Times New Roman"/>
+          <w:sz w:val="32"/>
+          <w:szCs w:val="32"/>
+          <w:rtl/>
+          <w:lang w:bidi="he-IL"/>
+        </w:rPr>
+        <w:t>'. המודל הנוכחי מתייחס לכל אחת מהן כאל מילה נפרדת לחלוטין</w:t>
       </w:r>
       <w:r>
         <w:rPr>
@@ -3471,7 +4060,29 @@
           <w:rtl/>
           <w:lang w:bidi="he-IL"/>
         </w:rPr>
-        <w:t>מתוך סך הכל כ1.3 מיליון מילים</w:t>
+        <w:t xml:space="preserve">מתוך סך </w:t>
+      </w:r>
+      <w:proofErr w:type="spellStart"/>
+      <w:r>
+        <w:rPr>
+          <w:rFonts w:ascii="Times New Roman" w:hAnsi="Times New Roman" w:cs="Times New Roman"/>
+          <w:sz w:val="32"/>
+          <w:szCs w:val="32"/>
+          <w:rtl/>
+          <w:lang w:bidi="he-IL"/>
+        </w:rPr>
+        <w:t>הכל</w:t>
+      </w:r>
+      <w:proofErr w:type="spellEnd"/>
+      <w:r>
+        <w:rPr>
+          <w:rFonts w:ascii="Times New Roman" w:hAnsi="Times New Roman" w:cs="Times New Roman"/>
+          <w:sz w:val="32"/>
+          <w:szCs w:val="32"/>
+          <w:rtl/>
+          <w:lang w:bidi="he-IL"/>
+        </w:rPr>
+        <w:t xml:space="preserve"> כ1.3 מיליון מילים</w:t>
       </w:r>
       <w:r>
         <w:rPr>
@@ -3821,14 +4432,25 @@
         </w:rPr>
         <w:t xml:space="preserve"> </w:t>
       </w:r>
-      <w:r>
-        <w:rPr>
-          <w:rFonts w:ascii="Times New Roman" w:hAnsi="Times New Roman" w:cs="Times New Roman"/>
-          <w:sz w:val="32"/>
-          <w:szCs w:val="32"/>
-          <w:lang w:bidi="he-IL"/>
-        </w:rPr>
-        <w:t xml:space="preserve">min_count=1, </w:t>
+      <w:proofErr w:type="spellStart"/>
+      <w:r>
+        <w:rPr>
+          <w:rFonts w:ascii="Times New Roman" w:hAnsi="Times New Roman" w:cs="Times New Roman"/>
+          <w:sz w:val="32"/>
+          <w:szCs w:val="32"/>
+          <w:lang w:bidi="he-IL"/>
+        </w:rPr>
+        <w:t>min_count</w:t>
+      </w:r>
+      <w:proofErr w:type="spellEnd"/>
+      <w:r>
+        <w:rPr>
+          <w:rFonts w:ascii="Times New Roman" w:hAnsi="Times New Roman" w:cs="Times New Roman"/>
+          <w:sz w:val="32"/>
+          <w:szCs w:val="32"/>
+          <w:lang w:bidi="he-IL"/>
+        </w:rPr>
+        <w:t xml:space="preserve">=1, </w:t>
       </w:r>
       <w:r>
         <w:rPr>
@@ -3885,6 +4507,7 @@
         </w:rPr>
         <w:t xml:space="preserve">: </w:t>
       </w:r>
+      <w:proofErr w:type="gramStart"/>
       <w:r>
         <w:rPr>
           <w:rFonts w:ascii="Times New Roman" w:hAnsi="Times New Roman" w:cs="Times New Roman"/>
@@ -3914,14 +4537,35 @@
         </w:rPr>
         <w:t xml:space="preserve"> </w:t>
       </w:r>
-      <w:r>
-        <w:rPr>
-          <w:rFonts w:ascii="Times New Roman" w:hAnsi="Times New Roman" w:cs="Times New Roman"/>
-          <w:sz w:val="32"/>
-          <w:szCs w:val="32"/>
-          <w:lang w:bidi="he-IL"/>
-        </w:rPr>
-        <w:t xml:space="preserve">vector_size=50, </w:t>
+      <w:proofErr w:type="spellStart"/>
+      <w:r>
+        <w:rPr>
+          <w:rFonts w:ascii="Times New Roman" w:hAnsi="Times New Roman" w:cs="Times New Roman"/>
+          <w:sz w:val="32"/>
+          <w:szCs w:val="32"/>
+          <w:lang w:bidi="he-IL"/>
+        </w:rPr>
+        <w:t>vector</w:t>
+      </w:r>
+      <w:proofErr w:type="gramEnd"/>
+      <w:r>
+        <w:rPr>
+          <w:rFonts w:ascii="Times New Roman" w:hAnsi="Times New Roman" w:cs="Times New Roman"/>
+          <w:sz w:val="32"/>
+          <w:szCs w:val="32"/>
+          <w:lang w:bidi="he-IL"/>
+        </w:rPr>
+        <w:t>_size</w:t>
+      </w:r>
+      <w:proofErr w:type="spellEnd"/>
+      <w:r>
+        <w:rPr>
+          <w:rFonts w:ascii="Times New Roman" w:hAnsi="Times New Roman" w:cs="Times New Roman"/>
+          <w:sz w:val="32"/>
+          <w:szCs w:val="32"/>
+          <w:lang w:bidi="he-IL"/>
+        </w:rPr>
+        <w:t xml:space="preserve">=50, </w:t>
       </w:r>
       <w:r>
         <w:rPr>
@@ -3966,8 +4610,22 @@
           <w:rtl/>
           <w:lang w:bidi="he-IL"/>
         </w:rPr>
-        <w:t>ג. שימושים פוטנציאליים: הטיות והתאמה לדומיין</w:t>
-      </w:r>
+        <w:t xml:space="preserve">ג. שימושים פוטנציאליים: הטיות והתאמה </w:t>
+      </w:r>
+      <w:proofErr w:type="spellStart"/>
+      <w:r>
+        <w:rPr>
+          <w:rFonts w:ascii="Times New Roman" w:hAnsi="Times New Roman" w:cs="Times New Roman"/>
+          <w:b/>
+          <w:bCs/>
+          <w:sz w:val="32"/>
+          <w:szCs w:val="32"/>
+          <w:rtl/>
+          <w:lang w:bidi="he-IL"/>
+        </w:rPr>
+        <w:t>לדומיין</w:t>
+      </w:r>
+      <w:proofErr w:type="spellEnd"/>
     </w:p>
     <w:p>
       <w:pPr>
@@ -3988,7 +4646,29 @@
           <w:rtl/>
           <w:lang w:bidi="he-IL"/>
         </w:rPr>
-        <w:t>המודל אומן על פרוטוקולים של הכנסת, מה שיוצר שתי בעיות עיקריות בשימוש בו לצרכים כלליים (כגון ניתוח טקסטים באינטרנט או צ'אטבוטים)</w:t>
+        <w:t xml:space="preserve">המודל אומן על פרוטוקולים של הכנסת, מה שיוצר שתי בעיות עיקריות בשימוש בו לצרכים כלליים (כגון ניתוח טקסטים באינטרנט או </w:t>
+      </w:r>
+      <w:proofErr w:type="spellStart"/>
+      <w:r>
+        <w:rPr>
+          <w:rFonts w:ascii="Times New Roman" w:hAnsi="Times New Roman" w:cs="Times New Roman"/>
+          <w:sz w:val="32"/>
+          <w:szCs w:val="32"/>
+          <w:rtl/>
+          <w:lang w:bidi="he-IL"/>
+        </w:rPr>
+        <w:t>צ'אטבוטים</w:t>
+      </w:r>
+      <w:proofErr w:type="spellEnd"/>
+      <w:r>
+        <w:rPr>
+          <w:rFonts w:ascii="Times New Roman" w:hAnsi="Times New Roman" w:cs="Times New Roman"/>
+          <w:sz w:val="32"/>
+          <w:szCs w:val="32"/>
+          <w:rtl/>
+          <w:lang w:bidi="he-IL"/>
+        </w:rPr>
+        <w:t>)</w:t>
       </w:r>
       <w:r>
         <w:rPr>
@@ -4517,6 +5197,7 @@
         </w:rPr>
         <w:t xml:space="preserve"> </w:t>
       </w:r>
+      <w:proofErr w:type="spellStart"/>
       <w:r>
         <w:rPr>
           <w:rFonts w:ascii="Times New Roman" w:hAnsi="Times New Roman" w:cs="Times New Roman"/>
@@ -4526,6 +5207,7 @@
         </w:rPr>
         <w:t>most_similar</w:t>
       </w:r>
+      <w:proofErr w:type="spellEnd"/>
       <w:r>
         <w:rPr>
           <w:rFonts w:ascii="Times New Roman" w:hAnsi="Times New Roman" w:cs="Times New Roman" w:hint="cs"/>
@@ -4572,7 +5254,29 @@
           <w:rtl/>
           <w:lang w:bidi="he-IL"/>
         </w:rPr>
-        <w:t>לדוגמה, במשפט 5 הוספנו את המילה "נדחתה" כוקטור שלילי כדי למנוע מהמודל להציע הפכים ולכוון אותו למילים המעידות על קבלה או אישור</w:t>
+        <w:t xml:space="preserve">לדוגמה, במשפט 5 הוספנו את המילה "נדחתה" </w:t>
+      </w:r>
+      <w:proofErr w:type="spellStart"/>
+      <w:r>
+        <w:rPr>
+          <w:rFonts w:ascii="Times New Roman" w:hAnsi="Times New Roman" w:cs="Times New Roman"/>
+          <w:sz w:val="32"/>
+          <w:szCs w:val="32"/>
+          <w:rtl/>
+          <w:lang w:bidi="he-IL"/>
+        </w:rPr>
+        <w:t>כוקטור</w:t>
+      </w:r>
+      <w:proofErr w:type="spellEnd"/>
+      <w:r>
+        <w:rPr>
+          <w:rFonts w:ascii="Times New Roman" w:hAnsi="Times New Roman" w:cs="Times New Roman"/>
+          <w:sz w:val="32"/>
+          <w:szCs w:val="32"/>
+          <w:rtl/>
+          <w:lang w:bidi="he-IL"/>
+        </w:rPr>
+        <w:t xml:space="preserve"> שלילי כדי למנוע מהמודל להציע הפכים ולכוון אותו למילים המעידות על קבלה או אישור</w:t>
       </w:r>
       <w:r>
         <w:rPr>
@@ -4949,8 +5653,20 @@
           <w:rtl/>
           <w:lang w:bidi="he-IL"/>
         </w:rPr>
-        <w:t>במשפט 5, המילה "ההצעה" הוחלפה ב-"השאילתא</w:t>
-      </w:r>
+        <w:t>במשפט 5, המילה "ההצעה" הוחלפה ב-"</w:t>
+      </w:r>
+      <w:proofErr w:type="spellStart"/>
+      <w:r>
+        <w:rPr>
+          <w:rFonts w:ascii="Times New Roman" w:hAnsi="Times New Roman" w:cs="Times New Roman"/>
+          <w:sz w:val="32"/>
+          <w:szCs w:val="32"/>
+          <w:rtl/>
+          <w:lang w:bidi="he-IL"/>
+        </w:rPr>
+        <w:t>השאילתא</w:t>
+      </w:r>
+      <w:proofErr w:type="spellEnd"/>
       <w:r>
         <w:rPr>
           <w:rFonts w:ascii="Times New Roman" w:hAnsi="Times New Roman" w:cs="Times New Roman"/>
@@ -5235,7 +5951,29 @@
           <w:rtl/>
           <w:lang w:bidi="he-IL"/>
         </w:rPr>
-        <w:t>כל המשפטים החדשים שנוצרו נותרו תקינים מבחינה דקדוקית (למשל, שמירה על מין ומספר כמו "השאילתא אושרה" במקום "ההצעה הובאה")</w:t>
+        <w:t>כל המשפטים החדשים שנוצרו נותרו תקינים מבחינה דקדוקית (למשל, שמירה על מין ומספר כמו "</w:t>
+      </w:r>
+      <w:proofErr w:type="spellStart"/>
+      <w:r>
+        <w:rPr>
+          <w:rFonts w:ascii="Times New Roman" w:hAnsi="Times New Roman" w:cs="Times New Roman"/>
+          <w:sz w:val="32"/>
+          <w:szCs w:val="32"/>
+          <w:rtl/>
+          <w:lang w:bidi="he-IL"/>
+        </w:rPr>
+        <w:t>השאילתא</w:t>
+      </w:r>
+      <w:proofErr w:type="spellEnd"/>
+      <w:r>
+        <w:rPr>
+          <w:rFonts w:ascii="Times New Roman" w:hAnsi="Times New Roman" w:cs="Times New Roman"/>
+          <w:sz w:val="32"/>
+          <w:szCs w:val="32"/>
+          <w:rtl/>
+          <w:lang w:bidi="he-IL"/>
+        </w:rPr>
+        <w:t xml:space="preserve"> אושרה" במקום "ההצעה הובאה")</w:t>
       </w:r>
     </w:p>
     <w:p>
@@ -5932,6 +6670,7 @@
         </w:rPr>
         <w:t xml:space="preserve"> </w:t>
       </w:r>
+      <w:proofErr w:type="spellStart"/>
       <w:r>
         <w:rPr>
           <w:rFonts w:ascii="Times New Roman" w:hAnsi="Times New Roman" w:cs="Times New Roman"/>
@@ -5942,6 +6681,7 @@
         </w:rPr>
         <w:t>למטיזציה</w:t>
       </w:r>
+      <w:proofErr w:type="spellEnd"/>
       <w:r>
         <w:rPr>
           <w:rFonts w:ascii="Times New Roman" w:hAnsi="Times New Roman" w:cs="Times New Roman"/>
@@ -8449,6 +9189,7 @@
         </w:rPr>
         <w:t xml:space="preserve"> </w:t>
       </w:r>
+      <w:proofErr w:type="spellStart"/>
       <w:r>
         <w:rPr>
           <w:rFonts w:ascii="Times New Roman" w:hAnsi="Times New Roman" w:cs="Times New Roman" w:hint="cs"/>
@@ -8461,6 +9202,7 @@
         </w:rPr>
         <w:t>חברי</w:t>
       </w:r>
+      <w:proofErr w:type="spellEnd"/>
       <w:r>
         <w:rPr>
           <w:rFonts w:ascii="Times New Roman" w:hAnsi="Times New Roman" w:cs="Times New Roman"/>
@@ -8865,7 +9607,29 @@
           <w:rtl/>
           <w:lang w:bidi="he-IL"/>
         </w:rPr>
-        <w:t>בקורפוס הכנסת ישנה חזרתיות רבה על משפטים מנהלתיים ותבניתיים</w:t>
+        <w:t xml:space="preserve">בקורפוס הכנסת ישנה </w:t>
+      </w:r>
+      <w:proofErr w:type="spellStart"/>
+      <w:r>
+        <w:rPr>
+          <w:rFonts w:ascii="Times New Roman" w:hAnsi="Times New Roman" w:cs="Times New Roman"/>
+          <w:sz w:val="32"/>
+          <w:szCs w:val="32"/>
+          <w:rtl/>
+          <w:lang w:bidi="he-IL"/>
+        </w:rPr>
+        <w:t>חזרתיות</w:t>
+      </w:r>
+      <w:proofErr w:type="spellEnd"/>
+      <w:r>
+        <w:rPr>
+          <w:rFonts w:ascii="Times New Roman" w:hAnsi="Times New Roman" w:cs="Times New Roman"/>
+          <w:sz w:val="32"/>
+          <w:szCs w:val="32"/>
+          <w:rtl/>
+          <w:lang w:bidi="he-IL"/>
+        </w:rPr>
+        <w:t xml:space="preserve"> רבה על משפטים מנהלתיים ותבניתיים</w:t>
       </w:r>
       <w:r>
         <w:rPr>
@@ -11183,7 +11947,29 @@
           <w:rtl/>
           <w:lang w:bidi="he-IL"/>
         </w:rPr>
-        <w:t>המילים "מדע", "טכנולוגיה", "מחקר" ו"חשיפה כימית" נושאות מטען סמנטי דומה בקורפוס (כמילים המופיעות בדיוני ועדות מקצועיות), ולכן הממוצע הווקטורי משייך אותן לאותו אזור נושאי</w:t>
+        <w:t xml:space="preserve">המילים "מדע", "טכנולוגיה", "מחקר" ו"חשיפה כימית" נושאות מטען סמנטי דומה בקורפוס (כמילים המופיעות בדיוני ועדות מקצועיות), ולכן הממוצע </w:t>
+      </w:r>
+      <w:proofErr w:type="spellStart"/>
+      <w:r>
+        <w:rPr>
+          <w:rFonts w:ascii="Times New Roman" w:hAnsi="Times New Roman" w:cs="Times New Roman"/>
+          <w:sz w:val="32"/>
+          <w:szCs w:val="32"/>
+          <w:rtl/>
+          <w:lang w:bidi="he-IL"/>
+        </w:rPr>
+        <w:t>הווקטורי</w:t>
+      </w:r>
+      <w:proofErr w:type="spellEnd"/>
+      <w:r>
+        <w:rPr>
+          <w:rFonts w:ascii="Times New Roman" w:hAnsi="Times New Roman" w:cs="Times New Roman"/>
+          <w:sz w:val="32"/>
+          <w:szCs w:val="32"/>
+          <w:rtl/>
+          <w:lang w:bidi="he-IL"/>
+        </w:rPr>
+        <w:t xml:space="preserve"> משייך אותן לאותו אזור נושאי</w:t>
       </w:r>
       <w:r>
         <w:rPr>
@@ -11717,7 +12503,7 @@
         <w:bidi/>
         <w:spacing w:after="0" w:line="240" w:lineRule="auto"/>
         <w:ind w:left="1440"/>
-        <w:jc w:val="right"/>
+        <w:jc w:val="center"/>
         <w:rPr>
           <w:rFonts w:ascii="Times New Roman" w:eastAsia="Times New Roman" w:hAnsi="Times New Roman" w:cs="Times New Roman"/>
           <w:b/>
@@ -11804,7 +12590,7 @@
           <w:lang w:bidi="he-IL"/>
           <w14:ligatures w14:val="none"/>
         </w:rPr>
-        <w:t>Classification report:</w:t>
+        <w:t>Classification report</w:t>
       </w:r>
     </w:p>
     <w:p>
@@ -12247,7 +13033,33 @@
           <w:lang w:bidi="he-IL"/>
           <w14:ligatures w14:val="none"/>
         </w:rPr>
-        <w:t>כאשר הייצוגים היו בעלי מימד גבוה (2000 תכונות)</w:t>
+        <w:t xml:space="preserve">כאשר הייצוגים היו בעלי </w:t>
+      </w:r>
+      <w:proofErr w:type="spellStart"/>
+      <w:r>
+        <w:rPr>
+          <w:rFonts w:asciiTheme="majorBidi" w:eastAsia="Times New Roman" w:hAnsiTheme="majorBidi" w:cstheme="majorBidi"/>
+          <w:kern w:val="0"/>
+          <w:sz w:val="32"/>
+          <w:szCs w:val="32"/>
+          <w:rtl/>
+          <w:lang w:bidi="he-IL"/>
+          <w14:ligatures w14:val="none"/>
+        </w:rPr>
+        <w:t>מימד</w:t>
+      </w:r>
+      <w:proofErr w:type="spellEnd"/>
+      <w:r>
+        <w:rPr>
+          <w:rFonts w:asciiTheme="majorBidi" w:eastAsia="Times New Roman" w:hAnsiTheme="majorBidi" w:cstheme="majorBidi"/>
+          <w:kern w:val="0"/>
+          <w:sz w:val="32"/>
+          <w:szCs w:val="32"/>
+          <w:rtl/>
+          <w:lang w:bidi="he-IL"/>
+          <w14:ligatures w14:val="none"/>
+        </w:rPr>
+        <w:t xml:space="preserve"> גבוה (2000 תכונות)</w:t>
       </w:r>
       <w:r>
         <w:rPr>
@@ -12420,14 +13232,40 @@
           <w:lang w:bidi="he-IL"/>
           <w14:ligatures w14:val="none"/>
         </w:rPr>
-        <w:t>כאשר כל משפט יוצג באמצעות וקטור צפוף באורך 50, המחושב כממוצע וקטורי המילים במשפט</w:t>
-      </w:r>
+        <w:t xml:space="preserve">כאשר כל משפט יוצג באמצעות וקטור צפוף באורך 50, המחושב כממוצע </w:t>
+      </w:r>
+      <w:proofErr w:type="spellStart"/>
       <w:r>
         <w:rPr>
           <w:rFonts w:ascii="Times New Roman" w:eastAsia="Times New Roman" w:hAnsi="Times New Roman" w:cs="Times New Roman"/>
           <w:kern w:val="0"/>
           <w:sz w:val="32"/>
           <w:szCs w:val="32"/>
+          <w:rtl/>
+          <w:lang w:bidi="he-IL"/>
+          <w14:ligatures w14:val="none"/>
+        </w:rPr>
+        <w:t>וקטורי</w:t>
+      </w:r>
+      <w:proofErr w:type="spellEnd"/>
+      <w:r>
+        <w:rPr>
+          <w:rFonts w:ascii="Times New Roman" w:eastAsia="Times New Roman" w:hAnsi="Times New Roman" w:cs="Times New Roman"/>
+          <w:kern w:val="0"/>
+          <w:sz w:val="32"/>
+          <w:szCs w:val="32"/>
+          <w:rtl/>
+          <w:lang w:bidi="he-IL"/>
+          <w14:ligatures w14:val="none"/>
+        </w:rPr>
+        <w:t xml:space="preserve"> המילים במשפט</w:t>
+      </w:r>
+      <w:r>
+        <w:rPr>
+          <w:rFonts w:ascii="Times New Roman" w:eastAsia="Times New Roman" w:hAnsi="Times New Roman" w:cs="Times New Roman"/>
+          <w:kern w:val="0"/>
+          <w:sz w:val="32"/>
+          <w:szCs w:val="32"/>
           <w:lang w:bidi="he-IL"/>
           <w14:ligatures w14:val="none"/>
         </w:rPr>
@@ -12473,6 +13311,8 @@
         <w:ind w:left="1440"/>
         <w:rPr>
           <w:rFonts w:ascii="Times New Roman" w:eastAsia="Times New Roman" w:hAnsi="Times New Roman" w:cs="Times New Roman"/>
+          <w:b/>
+          <w:bCs/>
           <w:kern w:val="0"/>
           <w:sz w:val="32"/>
           <w:szCs w:val="32"/>
@@ -12482,6 +13322,38 @@
         </w:rPr>
       </w:pPr>
       <w:r>
+        <w:rPr>
+          <w:rFonts w:ascii="Times New Roman" w:eastAsia="Times New Roman" w:hAnsi="Times New Roman" w:cs="Times New Roman"/>
+          <w:b/>
+          <w:bCs/>
+          <w:kern w:val="0"/>
+          <w:sz w:val="32"/>
+          <w:szCs w:val="32"/>
+          <w:rtl/>
+          <w:lang w:bidi="he-IL"/>
+          <w14:ligatures w14:val="none"/>
+        </w:rPr>
+        <w:t>השוואת תוצאות</w:t>
+      </w:r>
+      <w:r>
+        <w:rPr>
+          <w:rFonts w:ascii="Times New Roman" w:eastAsia="Times New Roman" w:hAnsi="Times New Roman" w:cs="Times New Roman"/>
+          <w:b/>
+          <w:bCs/>
+          <w:kern w:val="0"/>
+          <w:sz w:val="32"/>
+          <w:szCs w:val="32"/>
+          <w:lang w:bidi="he-IL"/>
+          <w14:ligatures w14:val="none"/>
+        </w:rPr>
+        <w:t xml:space="preserve"> (Binary Classification):</w:t>
+      </w:r>
+    </w:p>
+    <w:p>
+      <w:pPr>
+        <w:bidi/>
+        <w:spacing w:after="0" w:line="240" w:lineRule="auto"/>
+        <w:ind w:left="1440"/>
         <w:rPr>
           <w:rFonts w:ascii="Times New Roman" w:eastAsia="Times New Roman" w:hAnsi="Times New Roman" w:cs="Times New Roman"/>
           <w:kern w:val="0"/>
@@ -12491,44 +13363,16 @@
           <w:lang w:bidi="he-IL"/>
           <w14:ligatures w14:val="none"/>
         </w:rPr>
-        <w:t>השוואת תוצאות</w:t>
-      </w:r>
-      <w:r>
-        <w:rPr>
-          <w:rFonts w:ascii="Times New Roman" w:eastAsia="Times New Roman" w:hAnsi="Times New Roman" w:cs="Times New Roman"/>
-          <w:kern w:val="0"/>
-          <w:sz w:val="32"/>
-          <w:szCs w:val="32"/>
-          <w:lang w:bidi="he-IL"/>
-          <w14:ligatures w14:val="none"/>
-        </w:rPr>
-        <w:t xml:space="preserve"> (Binary Classification):</w:t>
-      </w:r>
-    </w:p>
-    <w:p>
-      <w:pPr>
-        <w:bidi/>
-        <w:spacing w:after="0" w:line="240" w:lineRule="auto"/>
-        <w:ind w:left="1440"/>
-        <w:rPr>
-          <w:rFonts w:ascii="Times New Roman" w:eastAsia="Times New Roman" w:hAnsi="Times New Roman" w:cs="Times New Roman"/>
-          <w:kern w:val="0"/>
-          <w:sz w:val="32"/>
-          <w:szCs w:val="32"/>
-          <w:rtl/>
-          <w:lang w:bidi="he-IL"/>
-          <w14:ligatures w14:val="none"/>
-        </w:rPr>
       </w:pPr>
       <w:r>
         <w:rPr>
           <w:noProof/>
         </w:rPr>
         <w:drawing>
-          <wp:anchor distT="0" distB="0" distL="114300" distR="114300" simplePos="0" relativeHeight="251659264" behindDoc="1" locked="0" layoutInCell="1" allowOverlap="1" wp14:anchorId="4D5B19E0" wp14:editId="3EBB791F">
+          <wp:anchor distT="0" distB="0" distL="114300" distR="114300" simplePos="0" relativeHeight="251659264" behindDoc="1" locked="0" layoutInCell="1" allowOverlap="1" wp14:anchorId="4D5B19E0" wp14:editId="31B8EE27">
             <wp:simplePos x="0" y="0"/>
             <wp:positionH relativeFrom="column">
-              <wp:posOffset>-815340</wp:posOffset>
+              <wp:posOffset>-732790</wp:posOffset>
             </wp:positionH>
             <wp:positionV relativeFrom="paragraph">
               <wp:posOffset>281940</wp:posOffset>
@@ -12597,34 +13441,18 @@
           </wp:anchor>
         </w:drawing>
       </w:r>
-    </w:p>
-    <w:p>
-      <w:pPr>
-        <w:bidi/>
-        <w:spacing w:after="0" w:line="240" w:lineRule="auto"/>
-        <w:ind w:left="1440"/>
-        <w:rPr>
-          <w:rFonts w:ascii="Times New Roman" w:eastAsia="Times New Roman" w:hAnsi="Times New Roman" w:cs="Times New Roman"/>
-          <w:kern w:val="0"/>
-          <w:sz w:val="32"/>
-          <w:szCs w:val="32"/>
-          <w:rtl/>
-          <w:lang w:bidi="he-IL"/>
-          <w14:ligatures w14:val="none"/>
-        </w:rPr>
-      </w:pPr>
       <w:r>
         <w:rPr>
           <w:noProof/>
         </w:rPr>
         <w:drawing>
-          <wp:anchor distT="0" distB="0" distL="114300" distR="114300" simplePos="0" relativeHeight="251660288" behindDoc="1" locked="0" layoutInCell="1" allowOverlap="1" wp14:anchorId="654ABF5A" wp14:editId="57ACB477">
+          <wp:anchor distT="0" distB="0" distL="114300" distR="114300" simplePos="0" relativeHeight="251660288" behindDoc="1" locked="0" layoutInCell="1" allowOverlap="1" wp14:anchorId="654ABF5A" wp14:editId="638993EE">
             <wp:simplePos x="0" y="0"/>
             <wp:positionH relativeFrom="column">
-              <wp:posOffset>2750820</wp:posOffset>
+              <wp:posOffset>2731770</wp:posOffset>
             </wp:positionH>
             <wp:positionV relativeFrom="paragraph">
-              <wp:posOffset>185420</wp:posOffset>
+              <wp:posOffset>292100</wp:posOffset>
             </wp:positionV>
             <wp:extent cx="3939540" cy="1592580"/>
             <wp:effectExtent l="0" t="0" r="3810" b="7620"/>
@@ -12807,6 +13635,22 @@
       <w:pPr>
         <w:bidi/>
         <w:spacing w:after="0" w:line="240" w:lineRule="auto"/>
+        <w:ind w:left="1440"/>
+        <w:rPr>
+          <w:rFonts w:ascii="Times New Roman" w:eastAsia="Times New Roman" w:hAnsi="Times New Roman" w:cs="Times New Roman"/>
+          <w:kern w:val="0"/>
+          <w:sz w:val="32"/>
+          <w:szCs w:val="32"/>
+          <w:rtl/>
+          <w:lang w:bidi="he-IL"/>
+          <w14:ligatures w14:val="none"/>
+        </w:rPr>
+      </w:pPr>
+    </w:p>
+    <w:p>
+      <w:pPr>
+        <w:bidi/>
+        <w:spacing w:after="0" w:line="240" w:lineRule="auto"/>
         <w:rPr>
           <w:rFonts w:ascii="Times New Roman" w:eastAsia="Times New Roman" w:hAnsi="Times New Roman" w:cs="Times New Roman"/>
           <w:b/>
@@ -13670,7 +14514,33 @@
           <w:lang w:bidi="he-IL"/>
           <w14:ligatures w14:val="none"/>
         </w:rPr>
-        <w:t>לוכדות את המשמעות הסמנטית הכללית אך עלולות “לטשטש” מידע דיסקרימינטיבי חשוב הקשור לסגנון אישי, מה שמוביל להטיה ב־</w:t>
+        <w:t xml:space="preserve">לוכדות את המשמעות הסמנטית הכללית אך עלולות “לטשטש” מידע </w:t>
+      </w:r>
+      <w:proofErr w:type="spellStart"/>
+      <w:r>
+        <w:rPr>
+          <w:rFonts w:ascii="Times New Roman" w:eastAsia="Times New Roman" w:hAnsi="Times New Roman" w:cs="Times New Roman"/>
+          <w:kern w:val="0"/>
+          <w:sz w:val="32"/>
+          <w:szCs w:val="32"/>
+          <w:rtl/>
+          <w:lang w:bidi="he-IL"/>
+          <w14:ligatures w14:val="none"/>
+        </w:rPr>
+        <w:t>דיסקרימינטיבי</w:t>
+      </w:r>
+      <w:proofErr w:type="spellEnd"/>
+      <w:r>
+        <w:rPr>
+          <w:rFonts w:ascii="Times New Roman" w:eastAsia="Times New Roman" w:hAnsi="Times New Roman" w:cs="Times New Roman"/>
+          <w:kern w:val="0"/>
+          <w:sz w:val="32"/>
+          <w:szCs w:val="32"/>
+          <w:rtl/>
+          <w:lang w:bidi="he-IL"/>
+          <w14:ligatures w14:val="none"/>
+        </w:rPr>
+        <w:t xml:space="preserve"> חשוב הקשור לסגנון אישי, מה שמוביל להטיה ב־</w:t>
       </w:r>
       <w:r>
         <w:rPr>
@@ -13903,6 +14773,17 @@
         <w:bidi/>
         <w:spacing w:after="0" w:line="240" w:lineRule="auto"/>
         <w:rPr>
+          <w:rFonts w:ascii="Times New Roman" w:eastAsia="Times New Roman" w:hAnsi="Times New Roman" w:cs="Times New Roman"/>
+          <w:kern w:val="0"/>
+          <w:sz w:val="32"/>
+          <w:szCs w:val="32"/>
+          <w:rtl/>
+          <w:lang w:bidi="he-IL"/>
+          <w14:ligatures w14:val="none"/>
+        </w:rPr>
+      </w:pPr>
+      <w:r>
+        <w:rPr>
           <w:rFonts w:ascii="Times New Roman" w:eastAsia="Times New Roman" w:hAnsi="Times New Roman" w:cs="Times New Roman" w:hint="cs"/>
           <w:kern w:val="0"/>
           <w:sz w:val="32"/>
@@ -13911,7 +14792,9 @@
           <w:lang w:bidi="he-IL"/>
           <w14:ligatures w14:val="none"/>
         </w:rPr>
-      </w:pPr>
+        <w:t xml:space="preserve">חשוב לציין שאחרי שהורדנו את גודל </w:t>
+      </w:r>
+      <w:proofErr w:type="spellStart"/>
       <w:r>
         <w:rPr>
           <w:rFonts w:ascii="Times New Roman" w:eastAsia="Times New Roman" w:hAnsi="Times New Roman" w:cs="Times New Roman" w:hint="cs"/>
@@ -13922,8 +14805,9 @@
           <w:lang w:bidi="he-IL"/>
           <w14:ligatures w14:val="none"/>
         </w:rPr>
-        <w:t xml:space="preserve">חשוב לציין שאחרי שהורדנו את גודל הוקטור להיות 25 </w:t>
-      </w:r>
+        <w:t>הוקטור</w:t>
+      </w:r>
+      <w:proofErr w:type="spellEnd"/>
       <w:r>
         <w:rPr>
           <w:rFonts w:ascii="Times New Roman" w:eastAsia="Times New Roman" w:hAnsi="Times New Roman" w:cs="Times New Roman" w:hint="cs"/>
@@ -13934,6 +14818,18 @@
           <w:lang w:bidi="he-IL"/>
           <w14:ligatures w14:val="none"/>
         </w:rPr>
+        <w:t xml:space="preserve"> להיות 25 </w:t>
+      </w:r>
+      <w:r>
+        <w:rPr>
+          <w:rFonts w:ascii="Times New Roman" w:eastAsia="Times New Roman" w:hAnsi="Times New Roman" w:cs="Times New Roman" w:hint="cs"/>
+          <w:kern w:val="0"/>
+          <w:sz w:val="32"/>
+          <w:szCs w:val="32"/>
+          <w:rtl/>
+          <w:lang w:bidi="he-IL"/>
+          <w14:ligatures w14:val="none"/>
+        </w:rPr>
         <w:t xml:space="preserve">ב </w:t>
       </w:r>
       <w:r>
@@ -13971,7 +14867,33 @@
           <w:lang w:bidi="he-IL"/>
           <w14:ligatures w14:val="none"/>
         </w:rPr>
-        <w:t xml:space="preserve">עדיין התקבלו תוצאות לא רעות בכלל יחסית לגודל הוקטור בהשוואה ל </w:t>
+        <w:t xml:space="preserve">עדיין התקבלו תוצאות לא רעות בכלל יחסית לגודל </w:t>
+      </w:r>
+      <w:proofErr w:type="spellStart"/>
+      <w:r>
+        <w:rPr>
+          <w:rFonts w:ascii="Times New Roman" w:eastAsia="Times New Roman" w:hAnsi="Times New Roman" w:cs="Times New Roman" w:hint="cs"/>
+          <w:kern w:val="0"/>
+          <w:sz w:val="32"/>
+          <w:szCs w:val="32"/>
+          <w:rtl/>
+          <w:lang w:bidi="he-IL"/>
+          <w14:ligatures w14:val="none"/>
+        </w:rPr>
+        <w:t>הוקטור</w:t>
+      </w:r>
+      <w:proofErr w:type="spellEnd"/>
+      <w:r>
+        <w:rPr>
+          <w:rFonts w:ascii="Times New Roman" w:eastAsia="Times New Roman" w:hAnsi="Times New Roman" w:cs="Times New Roman" w:hint="cs"/>
+          <w:kern w:val="0"/>
+          <w:sz w:val="32"/>
+          <w:szCs w:val="32"/>
+          <w:rtl/>
+          <w:lang w:bidi="he-IL"/>
+          <w14:ligatures w14:val="none"/>
+        </w:rPr>
+        <w:t xml:space="preserve"> בהשוואה ל </w:t>
       </w:r>
       <w:r>
         <w:rPr>
@@ -19041,6 +19963,7 @@
   <w:style w:type="character" w:default="1" w:styleId="DefaultParagraphFont">
     <w:name w:val="Default Paragraph Font"/>
     <w:uiPriority w:val="1"/>
+    <w:semiHidden/>
     <w:unhideWhenUsed/>
   </w:style>
   <w:style w:type="table" w:default="1" w:styleId="TableNormal">

</xml_diff>